<commit_message>
feat: tributacao completa e upload csv ui
</commit_message>
<xml_diff>
--- a/docs/Mod 7 - Tributação.docx
+++ b/docs/Mod 7 - Tributação.docx
@@ -4,7 +4,7 @@
   <w:body>
     <w:p>
       <w:r>
-        <w:t xml:space="preserve">Perfeito. O </w:t>
+        <w:t xml:space="preserve">O </w:t>
       </w:r>
       <w:r>
         <w:rPr>
@@ -246,7 +246,7 @@
     <w:p>
       <w:r>
         <w:pict w14:anchorId="44CAADA0">
-          <v:rect id="_x0000_i1247" style="width:0;height:1.5pt" o:hralign="center" o:hrstd="t" o:hr="t" fillcolor="#a0a0a0" stroked="f"/>
+          <v:rect id="_x0000_i1025" style="width:0;height:1.5pt" o:hralign="center" o:hrstd="t" o:hr="t" fillcolor="#a0a0a0" stroked="f"/>
         </w:pict>
       </w:r>
     </w:p>
@@ -603,7 +603,7 @@
     <w:p>
       <w:r>
         <w:pict w14:anchorId="2E73A759">
-          <v:rect id="_x0000_i1248" style="width:0;height:1.5pt" o:hralign="center" o:hrstd="t" o:hr="t" fillcolor="#a0a0a0" stroked="f"/>
+          <v:rect id="_x0000_i1026" style="width:0;height:1.5pt" o:hralign="center" o:hrstd="t" o:hr="t" fillcolor="#a0a0a0" stroked="f"/>
         </w:pict>
       </w:r>
     </w:p>
@@ -991,7 +991,7 @@
     <w:p>
       <w:r>
         <w:pict w14:anchorId="25E7BB1B">
-          <v:rect id="_x0000_i1249" style="width:0;height:1.5pt" o:hralign="center" o:hrstd="t" o:hr="t" fillcolor="#a0a0a0" stroked="f"/>
+          <v:rect id="_x0000_i1027" style="width:0;height:1.5pt" o:hralign="center" o:hrstd="t" o:hr="t" fillcolor="#a0a0a0" stroked="f"/>
         </w:pict>
       </w:r>
     </w:p>
@@ -1315,7 +1315,7 @@
     <w:p>
       <w:r>
         <w:pict w14:anchorId="4601B002">
-          <v:rect id="_x0000_i1250" style="width:0;height:1.5pt" o:hralign="center" o:hrstd="t" o:hr="t" fillcolor="#a0a0a0" stroked="f"/>
+          <v:rect id="_x0000_i1028" style="width:0;height:1.5pt" o:hralign="center" o:hrstd="t" o:hr="t" fillcolor="#a0a0a0" stroked="f"/>
         </w:pict>
       </w:r>
     </w:p>
@@ -1730,7 +1730,7 @@
     <w:p>
       <w:r>
         <w:pict w14:anchorId="49CA1537">
-          <v:rect id="_x0000_i1251" style="width:0;height:1.5pt" o:hralign="center" o:hrstd="t" o:hr="t" fillcolor="#a0a0a0" stroked="f"/>
+          <v:rect id="_x0000_i1029" style="width:0;height:1.5pt" o:hralign="center" o:hrstd="t" o:hr="t" fillcolor="#a0a0a0" stroked="f"/>
         </w:pict>
       </w:r>
     </w:p>
@@ -2387,7 +2387,7 @@
     <w:p>
       <w:r>
         <w:pict w14:anchorId="689CCCAC">
-          <v:rect id="_x0000_i1252" style="width:0;height:1.5pt" o:hralign="center" o:hrstd="t" o:hr="t" fillcolor="#a0a0a0" stroked="f"/>
+          <v:rect id="_x0000_i1030" style="width:0;height:1.5pt" o:hralign="center" o:hrstd="t" o:hr="t" fillcolor="#a0a0a0" stroked="f"/>
         </w:pict>
       </w:r>
     </w:p>
@@ -2797,7 +2797,7 @@
     <w:p>
       <w:r>
         <w:pict w14:anchorId="6264DFB0">
-          <v:rect id="_x0000_i1253" style="width:0;height:1.5pt" o:hralign="center" o:hrstd="t" o:hr="t" fillcolor="#a0a0a0" stroked="f"/>
+          <v:rect id="_x0000_i1031" style="width:0;height:1.5pt" o:hralign="center" o:hrstd="t" o:hr="t" fillcolor="#a0a0a0" stroked="f"/>
         </w:pict>
       </w:r>
     </w:p>
@@ -3279,7 +3279,7 @@
     <w:p>
       <w:r>
         <w:pict w14:anchorId="52E650C8">
-          <v:rect id="_x0000_i1254" style="width:0;height:1.5pt" o:hralign="center" o:hrstd="t" o:hr="t" fillcolor="#a0a0a0" stroked="f"/>
+          <v:rect id="_x0000_i1032" style="width:0;height:1.5pt" o:hralign="center" o:hrstd="t" o:hr="t" fillcolor="#a0a0a0" stroked="f"/>
         </w:pict>
       </w:r>
     </w:p>
@@ -3716,7 +3716,7 @@
     <w:p>
       <w:r>
         <w:pict w14:anchorId="68B5ED6F">
-          <v:rect id="_x0000_i1255" style="width:0;height:1.5pt" o:hralign="center" o:hrstd="t" o:hr="t" fillcolor="#a0a0a0" stroked="f"/>
+          <v:rect id="_x0000_i1033" style="width:0;height:1.5pt" o:hralign="center" o:hrstd="t" o:hr="t" fillcolor="#a0a0a0" stroked="f"/>
         </w:pict>
       </w:r>
     </w:p>
@@ -4143,7 +4143,7 @@
     <w:p>
       <w:r>
         <w:pict w14:anchorId="2662A0EE">
-          <v:rect id="_x0000_i1256" style="width:0;height:1.5pt" o:hralign="center" o:hrstd="t" o:hr="t" fillcolor="#a0a0a0" stroked="f"/>
+          <v:rect id="_x0000_i1034" style="width:0;height:1.5pt" o:hralign="center" o:hrstd="t" o:hr="t" fillcolor="#a0a0a0" stroked="f"/>
         </w:pict>
       </w:r>
     </w:p>
@@ -4575,7 +4575,7 @@
     <w:p>
       <w:r>
         <w:pict w14:anchorId="30C489A0">
-          <v:rect id="_x0000_i1257" style="width:0;height:1.5pt" o:hralign="center" o:hrstd="t" o:hr="t" fillcolor="#a0a0a0" stroked="f"/>
+          <v:rect id="_x0000_i1035" style="width:0;height:1.5pt" o:hralign="center" o:hrstd="t" o:hr="t" fillcolor="#a0a0a0" stroked="f"/>
         </w:pict>
       </w:r>
     </w:p>
@@ -4876,7 +4876,7 @@
     <w:p>
       <w:r>
         <w:pict w14:anchorId="7EE09DAE">
-          <v:rect id="_x0000_i1258" style="width:0;height:1.5pt" o:hralign="center" o:hrstd="t" o:hr="t" fillcolor="#a0a0a0" stroked="f"/>
+          <v:rect id="_x0000_i1036" style="width:0;height:1.5pt" o:hralign="center" o:hrstd="t" o:hr="t" fillcolor="#a0a0a0" stroked="f"/>
         </w:pict>
       </w:r>
     </w:p>
@@ -5282,7 +5282,7 @@
     <w:p>
       <w:r>
         <w:pict w14:anchorId="0A0E2542">
-          <v:rect id="_x0000_i1259" style="width:0;height:1.5pt" o:hralign="center" o:hrstd="t" o:hr="t" fillcolor="#a0a0a0" stroked="f"/>
+          <v:rect id="_x0000_i1037" style="width:0;height:1.5pt" o:hralign="center" o:hrstd="t" o:hr="t" fillcolor="#a0a0a0" stroked="f"/>
         </w:pict>
       </w:r>
     </w:p>
@@ -5741,7 +5741,7 @@
     <w:p>
       <w:r>
         <w:pict w14:anchorId="5BB810FE">
-          <v:rect id="_x0000_i1260" style="width:0;height:1.5pt" o:hralign="center" o:hrstd="t" o:hr="t" fillcolor="#a0a0a0" stroked="f"/>
+          <v:rect id="_x0000_i1038" style="width:0;height:1.5pt" o:hralign="center" o:hrstd="t" o:hr="t" fillcolor="#a0a0a0" stroked="f"/>
         </w:pict>
       </w:r>
     </w:p>
@@ -6085,7 +6085,7 @@
     <w:p>
       <w:r>
         <w:pict w14:anchorId="3F70CD12">
-          <v:rect id="_x0000_i1261" style="width:0;height:1.5pt" o:hralign="center" o:hrstd="t" o:hr="t" fillcolor="#a0a0a0" stroked="f"/>
+          <v:rect id="_x0000_i1039" style="width:0;height:1.5pt" o:hralign="center" o:hrstd="t" o:hr="t" fillcolor="#a0a0a0" stroked="f"/>
         </w:pict>
       </w:r>
     </w:p>
@@ -6350,7 +6350,7 @@
     <w:p>
       <w:r>
         <w:pict w14:anchorId="6577FB7C">
-          <v:rect id="_x0000_i1262" style="width:0;height:1.5pt" o:hralign="center" o:hrstd="t" o:hr="t" fillcolor="#a0a0a0" stroked="f"/>
+          <v:rect id="_x0000_i1040" style="width:0;height:1.5pt" o:hralign="center" o:hrstd="t" o:hr="t" fillcolor="#a0a0a0" stroked="f"/>
         </w:pict>
       </w:r>
     </w:p>
@@ -6777,7 +6777,7 @@
       <w:r>
         <w:lastRenderedPageBreak/>
         <w:pict w14:anchorId="46F7BCFB">
-          <v:rect id="_x0000_i1263" style="width:0;height:1.5pt" o:hralign="center" o:hrstd="t" o:hr="t" fillcolor="#a0a0a0" stroked="f"/>
+          <v:rect id="_x0000_i1041" style="width:0;height:1.5pt" o:hralign="center" o:hrstd="t" o:hr="t" fillcolor="#a0a0a0" stroked="f"/>
         </w:pict>
       </w:r>
     </w:p>
@@ -7236,7 +7236,7 @@
     <w:p>
       <w:r>
         <w:pict w14:anchorId="2919C978">
-          <v:rect id="_x0000_i1264" style="width:0;height:1.5pt" o:hralign="center" o:hrstd="t" o:hr="t" fillcolor="#a0a0a0" stroked="f"/>
+          <v:rect id="_x0000_i1042" style="width:0;height:1.5pt" o:hralign="center" o:hrstd="t" o:hr="t" fillcolor="#a0a0a0" stroked="f"/>
         </w:pict>
       </w:r>
     </w:p>
@@ -7400,7 +7400,7 @@
     <w:p>
       <w:r>
         <w:pict w14:anchorId="5D52C3BA">
-          <v:rect id="_x0000_i1265" style="width:0;height:1.5pt" o:hralign="center" o:hrstd="t" o:hr="t" fillcolor="#a0a0a0" stroked="f"/>
+          <v:rect id="_x0000_i1043" style="width:0;height:1.5pt" o:hralign="center" o:hrstd="t" o:hr="t" fillcolor="#a0a0a0" stroked="f"/>
         </w:pict>
       </w:r>
     </w:p>
@@ -7557,7 +7557,7 @@
     <w:p>
       <w:r>
         <w:pict w14:anchorId="4B2BAD2E">
-          <v:rect id="_x0000_i1266" style="width:0;height:1.5pt" o:hralign="center" o:hrstd="t" o:hr="t" fillcolor="#a0a0a0" stroked="f"/>
+          <v:rect id="_x0000_i1044" style="width:0;height:1.5pt" o:hralign="center" o:hrstd="t" o:hr="t" fillcolor="#a0a0a0" stroked="f"/>
         </w:pict>
       </w:r>
     </w:p>
@@ -7836,7 +7836,7 @@
     <w:p>
       <w:r>
         <w:pict w14:anchorId="659FAC27">
-          <v:rect id="_x0000_i1267" style="width:0;height:1.5pt" o:hralign="center" o:hrstd="t" o:hr="t" fillcolor="#a0a0a0" stroked="f"/>
+          <v:rect id="_x0000_i1045" style="width:0;height:1.5pt" o:hralign="center" o:hrstd="t" o:hr="t" fillcolor="#a0a0a0" stroked="f"/>
         </w:pict>
       </w:r>
     </w:p>
@@ -8066,7 +8066,7 @@
     <w:p>
       <w:r>
         <w:pict w14:anchorId="399C4A55">
-          <v:rect id="_x0000_i1268" style="width:0;height:1.5pt" o:hralign="center" o:hrstd="t" o:hr="t" fillcolor="#a0a0a0" stroked="f"/>
+          <v:rect id="_x0000_i1046" style="width:0;height:1.5pt" o:hralign="center" o:hrstd="t" o:hr="t" fillcolor="#a0a0a0" stroked="f"/>
         </w:pict>
       </w:r>
     </w:p>
@@ -8307,7 +8307,7 @@
     <w:p>
       <w:r>
         <w:pict w14:anchorId="3BDC6384">
-          <v:rect id="_x0000_i1269" style="width:0;height:1.5pt" o:hralign="center" o:hrstd="t" o:hr="t" fillcolor="#a0a0a0" stroked="f"/>
+          <v:rect id="_x0000_i1047" style="width:0;height:1.5pt" o:hralign="center" o:hrstd="t" o:hr="t" fillcolor="#a0a0a0" stroked="f"/>
         </w:pict>
       </w:r>
     </w:p>
@@ -8612,7 +8612,7 @@
     <w:p>
       <w:r>
         <w:pict w14:anchorId="10E2811E">
-          <v:rect id="_x0000_i1270" style="width:0;height:1.5pt" o:hralign="center" o:hrstd="t" o:hr="t" fillcolor="#a0a0a0" stroked="f"/>
+          <v:rect id="_x0000_i1048" style="width:0;height:1.5pt" o:hralign="center" o:hrstd="t" o:hr="t" fillcolor="#a0a0a0" stroked="f"/>
         </w:pict>
       </w:r>
     </w:p>
@@ -8835,7 +8835,7 @@
     <w:p>
       <w:r>
         <w:pict w14:anchorId="5C801E49">
-          <v:rect id="_x0000_i1271" style="width:0;height:1.5pt" o:hralign="center" o:hrstd="t" o:hr="t" fillcolor="#a0a0a0" stroked="f"/>
+          <v:rect id="_x0000_i1049" style="width:0;height:1.5pt" o:hralign="center" o:hrstd="t" o:hr="t" fillcolor="#a0a0a0" stroked="f"/>
         </w:pict>
       </w:r>
     </w:p>
@@ -9088,7 +9088,7 @@
     <w:p>
       <w:r>
         <w:pict w14:anchorId="3A16ADD0">
-          <v:rect id="_x0000_i1272" style="width:0;height:1.5pt" o:hralign="center" o:hrstd="t" o:hr="t" fillcolor="#a0a0a0" stroked="f"/>
+          <v:rect id="_x0000_i1050" style="width:0;height:1.5pt" o:hralign="center" o:hrstd="t" o:hr="t" fillcolor="#a0a0a0" stroked="f"/>
         </w:pict>
       </w:r>
     </w:p>
@@ -9198,7 +9198,7 @@
     <w:p>
       <w:r>
         <w:pict w14:anchorId="1316CF7E">
-          <v:rect id="_x0000_i1273" style="width:0;height:1.5pt" o:hralign="center" o:hrstd="t" o:hr="t" fillcolor="#a0a0a0" stroked="f"/>
+          <v:rect id="_x0000_i1051" style="width:0;height:1.5pt" o:hralign="center" o:hrstd="t" o:hr="t" fillcolor="#a0a0a0" stroked="f"/>
         </w:pict>
       </w:r>
     </w:p>
@@ -9591,7 +9591,7 @@
     <w:p>
       <w:r>
         <w:pict w14:anchorId="6D22E0D3">
-          <v:rect id="_x0000_i1274" style="width:0;height:1.5pt" o:hralign="center" o:hrstd="t" o:hr="t" fillcolor="#a0a0a0" stroked="f"/>
+          <v:rect id="_x0000_i1052" style="width:0;height:1.5pt" o:hralign="center" o:hrstd="t" o:hr="t" fillcolor="#a0a0a0" stroked="f"/>
         </w:pict>
       </w:r>
     </w:p>
@@ -9894,7 +9894,7 @@
     <w:p>
       <w:r>
         <w:pict w14:anchorId="6E17E680">
-          <v:rect id="_x0000_i1275" style="width:0;height:1.5pt" o:hralign="center" o:hrstd="t" o:hr="t" fillcolor="#a0a0a0" stroked="f"/>
+          <v:rect id="_x0000_i1053" style="width:0;height:1.5pt" o:hralign="center" o:hrstd="t" o:hr="t" fillcolor="#a0a0a0" stroked="f"/>
         </w:pict>
       </w:r>
     </w:p>
@@ -10240,7 +10240,7 @@
     <w:p>
       <w:r>
         <w:pict w14:anchorId="25F2B36A">
-          <v:rect id="_x0000_i1276" style="width:0;height:1.5pt" o:hralign="center" o:hrstd="t" o:hr="t" fillcolor="#a0a0a0" stroked="f"/>
+          <v:rect id="_x0000_i1054" style="width:0;height:1.5pt" o:hralign="center" o:hrstd="t" o:hr="t" fillcolor="#a0a0a0" stroked="f"/>
         </w:pict>
       </w:r>
     </w:p>
@@ -10688,7 +10688,7 @@
     <w:p>
       <w:r>
         <w:pict w14:anchorId="6AD9A72C">
-          <v:rect id="_x0000_i1277" style="width:0;height:1.5pt" o:hralign="center" o:hrstd="t" o:hr="t" fillcolor="#a0a0a0" stroked="f"/>
+          <v:rect id="_x0000_i1055" style="width:0;height:1.5pt" o:hralign="center" o:hrstd="t" o:hr="t" fillcolor="#a0a0a0" stroked="f"/>
         </w:pict>
       </w:r>
     </w:p>
@@ -11447,7 +11447,7 @@
     <w:p>
       <w:r>
         <w:pict w14:anchorId="3AEF2FA2">
-          <v:rect id="_x0000_i1278" style="width:0;height:1.5pt" o:hralign="center" o:hrstd="t" o:hr="t" fillcolor="#a0a0a0" stroked="f"/>
+          <v:rect id="_x0000_i1056" style="width:0;height:1.5pt" o:hralign="center" o:hrstd="t" o:hr="t" fillcolor="#a0a0a0" stroked="f"/>
         </w:pict>
       </w:r>
     </w:p>
@@ -11649,7 +11649,7 @@
     <w:p>
       <w:r>
         <w:pict w14:anchorId="05031C04">
-          <v:rect id="_x0000_i1279" style="width:0;height:1.5pt" o:hralign="center" o:hrstd="t" o:hr="t" fillcolor="#a0a0a0" stroked="f"/>
+          <v:rect id="_x0000_i1057" style="width:0;height:1.5pt" o:hralign="center" o:hrstd="t" o:hr="t" fillcolor="#a0a0a0" stroked="f"/>
         </w:pict>
       </w:r>
     </w:p>
@@ -12231,7 +12231,7 @@
     <w:p>
       <w:r>
         <w:pict w14:anchorId="635687D6">
-          <v:rect id="_x0000_i1280" style="width:0;height:1.5pt" o:hralign="center" o:hrstd="t" o:hr="t" fillcolor="#a0a0a0" stroked="f"/>
+          <v:rect id="_x0000_i1058" style="width:0;height:1.5pt" o:hralign="center" o:hrstd="t" o:hr="t" fillcolor="#a0a0a0" stroked="f"/>
         </w:pict>
       </w:r>
     </w:p>
@@ -12462,7 +12462,7 @@
     <w:p>
       <w:r>
         <w:pict w14:anchorId="09A61A67">
-          <v:rect id="_x0000_i1281" style="width:0;height:1.5pt" o:hralign="center" o:hrstd="t" o:hr="t" fillcolor="#a0a0a0" stroked="f"/>
+          <v:rect id="_x0000_i1059" style="width:0;height:1.5pt" o:hralign="center" o:hrstd="t" o:hr="t" fillcolor="#a0a0a0" stroked="f"/>
         </w:pict>
       </w:r>
     </w:p>
@@ -12478,12 +12478,12 @@
           <w:b/>
           <w:bCs/>
         </w:rPr>
-        <w:t>Versão avançada</w:t>
-      </w:r>
-    </w:p>
-    <w:p>
-      <w:r>
-        <w:t>Depois, você pode evoluir para:</w:t>
+        <w:t>Menu final enxuto para a tela</w:t>
+      </w:r>
+    </w:p>
+    <w:p>
+      <w:r>
+        <w:t>Para não ficar grande demais, eu deixaria assim:</w:t>
       </w:r>
     </w:p>
     <w:p>
@@ -12494,7 +12494,11 @@
         </w:numPr>
       </w:pPr>
       <w:r>
-        <w:t>NFS-e completa;</w:t>
+        <w:rPr>
+          <w:b/>
+          <w:bCs/>
+        </w:rPr>
+        <w:t>Painel</w:t>
       </w:r>
     </w:p>
     <w:p>
@@ -12505,7 +12509,11 @@
         </w:numPr>
       </w:pPr>
       <w:r>
-        <w:t>integração com padrão nacional;</w:t>
+        <w:rPr>
+          <w:b/>
+          <w:bCs/>
+        </w:rPr>
+        <w:t>Contribuintes</w:t>
       </w:r>
     </w:p>
     <w:p>
@@ -12516,7 +12524,11 @@
         </w:numPr>
       </w:pPr>
       <w:r>
-        <w:t>PIX automático;</w:t>
+        <w:rPr>
+          <w:b/>
+          <w:bCs/>
+        </w:rPr>
+        <w:t>Imóveis</w:t>
       </w:r>
     </w:p>
     <w:p>
@@ -12527,7 +12539,11 @@
         </w:numPr>
       </w:pPr>
       <w:r>
-        <w:t>boleto registrado;</w:t>
+        <w:rPr>
+          <w:b/>
+          <w:bCs/>
+        </w:rPr>
+        <w:t>Empresas / Econômico</w:t>
       </w:r>
     </w:p>
     <w:p>
@@ -12538,7 +12554,11 @@
         </w:numPr>
       </w:pPr>
       <w:r>
-        <w:t>CNAB completo;</w:t>
+        <w:rPr>
+          <w:b/>
+          <w:bCs/>
+        </w:rPr>
+        <w:t>IPTU</w:t>
       </w:r>
     </w:p>
     <w:p>
@@ -12549,7 +12569,11 @@
         </w:numPr>
       </w:pPr>
       <w:r>
-        <w:t>cobrança administrativa automatizada;</w:t>
+        <w:rPr>
+          <w:b/>
+          <w:bCs/>
+        </w:rPr>
+        <w:t>ITBI</w:t>
       </w:r>
     </w:p>
     <w:p>
@@ -12560,7 +12584,11 @@
         </w:numPr>
       </w:pPr>
       <w:r>
-        <w:t>protesto integrado;</w:t>
+        <w:rPr>
+          <w:b/>
+          <w:bCs/>
+        </w:rPr>
+        <w:t>ISS / NFS-e</w:t>
       </w:r>
     </w:p>
     <w:p>
@@ -12571,7 +12599,11 @@
         </w:numPr>
       </w:pPr>
       <w:r>
-        <w:t>planta genérica de valores avançada;</w:t>
+        <w:rPr>
+          <w:b/>
+          <w:bCs/>
+        </w:rPr>
+        <w:t>Taxas e Alvarás</w:t>
       </w:r>
     </w:p>
     <w:p>
@@ -12582,7 +12614,11 @@
         </w:numPr>
       </w:pPr>
       <w:r>
-        <w:t>georreferenciamento de imóveis;</w:t>
+        <w:rPr>
+          <w:b/>
+          <w:bCs/>
+        </w:rPr>
+        <w:t>Guias</w:t>
       </w:r>
     </w:p>
     <w:p>
@@ -12593,7 +12629,11 @@
         </w:numPr>
       </w:pPr>
       <w:r>
-        <w:t>fiscalização mobile;</w:t>
+        <w:rPr>
+          <w:b/>
+          <w:bCs/>
+        </w:rPr>
+        <w:t>Pagamentos</w:t>
       </w:r>
     </w:p>
     <w:p>
@@ -12604,7 +12644,11 @@
         </w:numPr>
       </w:pPr>
       <w:r>
-        <w:t>auditoria de ISS;</w:t>
+        <w:rPr>
+          <w:b/>
+          <w:bCs/>
+        </w:rPr>
+        <w:t>Parcelamentos</w:t>
       </w:r>
     </w:p>
     <w:p>
@@ -12615,7 +12659,11 @@
         </w:numPr>
       </w:pPr>
       <w:r>
-        <w:t>declaração eletrônica de ISS;</w:t>
+        <w:rPr>
+          <w:b/>
+          <w:bCs/>
+        </w:rPr>
+        <w:t>Dívida Ativa</w:t>
       </w:r>
     </w:p>
     <w:p>
@@ -12626,7 +12674,11 @@
         </w:numPr>
       </w:pPr>
       <w:r>
-        <w:t>livro fiscal eletrônico;</w:t>
+        <w:rPr>
+          <w:b/>
+          <w:bCs/>
+        </w:rPr>
+        <w:t>Certidões</w:t>
       </w:r>
     </w:p>
     <w:p>
@@ -12637,7 +12689,11 @@
         </w:numPr>
       </w:pPr>
       <w:r>
-        <w:t>cruzamento de dados;</w:t>
+        <w:rPr>
+          <w:b/>
+          <w:bCs/>
+        </w:rPr>
+        <w:t>Fiscalização</w:t>
       </w:r>
     </w:p>
     <w:p>
@@ -12648,7 +12704,11 @@
         </w:numPr>
       </w:pPr>
       <w:r>
-        <w:t>BI tributário;</w:t>
+        <w:rPr>
+          <w:b/>
+          <w:bCs/>
+        </w:rPr>
+        <w:t>Processos Tributários</w:t>
       </w:r>
     </w:p>
     <w:p>
@@ -12659,7 +12719,11 @@
         </w:numPr>
       </w:pPr>
       <w:r>
-        <w:t>mapa de inadimplência;</w:t>
+        <w:rPr>
+          <w:b/>
+          <w:bCs/>
+        </w:rPr>
+        <w:t>Portal do Contribuinte</w:t>
       </w:r>
     </w:p>
     <w:p>
@@ -12670,8 +12734,12 @@
         </w:numPr>
       </w:pPr>
       <w:r>
+        <w:rPr>
+          <w:b/>
+          <w:bCs/>
+        </w:rPr>
         <w:lastRenderedPageBreak/>
-        <w:t>inteligência para identificar omissões;</w:t>
+        <w:t>Parâmetros</w:t>
       </w:r>
     </w:p>
     <w:p>
@@ -12682,7 +12750,11 @@
         </w:numPr>
       </w:pPr>
       <w:r>
-        <w:t>integração com cartórios para ITBI;</w:t>
+        <w:rPr>
+          <w:b/>
+          <w:bCs/>
+        </w:rPr>
+        <w:t>Relatórios</w:t>
       </w:r>
     </w:p>
     <w:p>
@@ -12693,35 +12765,17 @@
         </w:numPr>
       </w:pPr>
       <w:r>
-        <w:t>integração com Receita Federal para CNPJ;</w:t>
-      </w:r>
-    </w:p>
-    <w:p>
-      <w:pPr>
-        <w:numPr>
-          <w:ilvl w:val="0"/>
-          <w:numId w:val="83"/>
-        </w:numPr>
-      </w:pPr>
-      <w:r>
-        <w:t>integração com contabilidade em tempo real;</w:t>
-      </w:r>
-    </w:p>
-    <w:p>
-      <w:pPr>
-        <w:numPr>
-          <w:ilvl w:val="0"/>
-          <w:numId w:val="83"/>
-        </w:numPr>
-      </w:pPr>
-      <w:r>
-        <w:t>integração com Portal da Transparência.</w:t>
-      </w:r>
-    </w:p>
-    <w:p>
-      <w:r>
-        <w:pict w14:anchorId="444F85FC">
-          <v:rect id="_x0000_i1282" style="width:0;height:1.5pt" o:hralign="center" o:hrstd="t" o:hr="t" fillcolor="#a0a0a0" stroked="f"/>
+        <w:rPr>
+          <w:b/>
+          <w:bCs/>
+        </w:rPr>
+        <w:t>Auditoria</w:t>
+      </w:r>
+    </w:p>
+    <w:p>
+      <w:r>
+        <w:pict w14:anchorId="39D3E09A">
+          <v:rect id="_x0000_i1061" style="width:0;height:1.5pt" o:hralign="center" o:hrstd="t" o:hr="t" fillcolor="#a0a0a0" stroked="f"/>
         </w:pict>
       </w:r>
     </w:p>
@@ -12737,12 +12791,22 @@
           <w:b/>
           <w:bCs/>
         </w:rPr>
-        <w:t>Menu final enxuto para a tela</w:t>
-      </w:r>
-    </w:p>
-    <w:p>
-      <w:r>
-        <w:t>Para não ficar grande demais, eu deixaria assim:</w:t>
+        <w:t>Resumo prático</w:t>
+      </w:r>
+    </w:p>
+    <w:p>
+      <w:r>
+        <w:t xml:space="preserve">O </w:t>
+      </w:r>
+      <w:r>
+        <w:rPr>
+          <w:b/>
+          <w:bCs/>
+        </w:rPr>
+        <w:t>Módulo 7 — Tributário</w:t>
+      </w:r>
+      <w:r>
+        <w:t xml:space="preserve"> deve cuidar de:</w:t>
       </w:r>
     </w:p>
     <w:p>
@@ -12753,11 +12817,7 @@
         </w:numPr>
       </w:pPr>
       <w:r>
-        <w:rPr>
-          <w:b/>
-          <w:bCs/>
-        </w:rPr>
-        <w:t>Painel</w:t>
+        <w:t>contribuintes;</w:t>
       </w:r>
     </w:p>
     <w:p>
@@ -12768,11 +12828,7 @@
         </w:numPr>
       </w:pPr>
       <w:r>
-        <w:rPr>
-          <w:b/>
-          <w:bCs/>
-        </w:rPr>
-        <w:t>Contribuintes</w:t>
+        <w:t>imóveis fiscais;</w:t>
       </w:r>
     </w:p>
     <w:p>
@@ -12783,11 +12839,7 @@
         </w:numPr>
       </w:pPr>
       <w:r>
-        <w:rPr>
-          <w:b/>
-          <w:bCs/>
-        </w:rPr>
-        <w:t>Imóveis</w:t>
+        <w:t>empresas e inscrições municipais;</w:t>
       </w:r>
     </w:p>
     <w:p>
@@ -12798,11 +12850,7 @@
         </w:numPr>
       </w:pPr>
       <w:r>
-        <w:rPr>
-          <w:b/>
-          <w:bCs/>
-        </w:rPr>
-        <w:t>Empresas / Econômico</w:t>
+        <w:t>IPTU;</w:t>
       </w:r>
     </w:p>
     <w:p>
@@ -12813,11 +12861,7 @@
         </w:numPr>
       </w:pPr>
       <w:r>
-        <w:rPr>
-          <w:b/>
-          <w:bCs/>
-        </w:rPr>
-        <w:t>IPTU</w:t>
+        <w:t>ITBI;</w:t>
       </w:r>
     </w:p>
     <w:p>
@@ -12828,11 +12872,7 @@
         </w:numPr>
       </w:pPr>
       <w:r>
-        <w:rPr>
-          <w:b/>
-          <w:bCs/>
-        </w:rPr>
-        <w:t>ITBI</w:t>
+        <w:t>ISS;</w:t>
       </w:r>
     </w:p>
     <w:p>
@@ -12843,11 +12883,7 @@
         </w:numPr>
       </w:pPr>
       <w:r>
-        <w:rPr>
-          <w:b/>
-          <w:bCs/>
-        </w:rPr>
-        <w:t>ISS / NFS-e</w:t>
+        <w:t>NFS-e;</w:t>
       </w:r>
     </w:p>
     <w:p>
@@ -12858,11 +12894,7 @@
         </w:numPr>
       </w:pPr>
       <w:r>
-        <w:rPr>
-          <w:b/>
-          <w:bCs/>
-        </w:rPr>
-        <w:t>Taxas e Alvarás</w:t>
+        <w:t>taxas municipais;</w:t>
       </w:r>
     </w:p>
     <w:p>
@@ -12873,11 +12905,7 @@
         </w:numPr>
       </w:pPr>
       <w:r>
-        <w:rPr>
-          <w:b/>
-          <w:bCs/>
-        </w:rPr>
-        <w:t>Guias</w:t>
+        <w:t>alvarás;</w:t>
       </w:r>
     </w:p>
     <w:p>
@@ -12888,11 +12916,7 @@
         </w:numPr>
       </w:pPr>
       <w:r>
-        <w:rPr>
-          <w:b/>
-          <w:bCs/>
-        </w:rPr>
-        <w:t>Pagamentos</w:t>
+        <w:t>emissão de guias;</w:t>
       </w:r>
     </w:p>
     <w:p>
@@ -12903,11 +12927,7 @@
         </w:numPr>
       </w:pPr>
       <w:r>
-        <w:rPr>
-          <w:b/>
-          <w:bCs/>
-        </w:rPr>
-        <w:t>Parcelamentos</w:t>
+        <w:t>pagamentos;</w:t>
       </w:r>
     </w:p>
     <w:p>
@@ -12918,11 +12938,7 @@
         </w:numPr>
       </w:pPr>
       <w:r>
-        <w:rPr>
-          <w:b/>
-          <w:bCs/>
-        </w:rPr>
-        <w:t>Dívida Ativa</w:t>
+        <w:t>baixas;</w:t>
       </w:r>
     </w:p>
     <w:p>
@@ -12933,11 +12949,7 @@
         </w:numPr>
       </w:pPr>
       <w:r>
-        <w:rPr>
-          <w:b/>
-          <w:bCs/>
-        </w:rPr>
-        <w:t>Certidões</w:t>
+        <w:t>PIX/boleto/CNAB;</w:t>
       </w:r>
     </w:p>
     <w:p>
@@ -12948,11 +12960,7 @@
         </w:numPr>
       </w:pPr>
       <w:r>
-        <w:rPr>
-          <w:b/>
-          <w:bCs/>
-        </w:rPr>
-        <w:t>Fiscalização</w:t>
+        <w:t>parcelamentos;</w:t>
       </w:r>
     </w:p>
     <w:p>
@@ -12963,11 +12971,7 @@
         </w:numPr>
       </w:pPr>
       <w:r>
-        <w:rPr>
-          <w:b/>
-          <w:bCs/>
-        </w:rPr>
-        <w:t>Processos Tributários</w:t>
+        <w:t>dívida ativa;</w:t>
       </w:r>
     </w:p>
     <w:p>
@@ -12978,11 +12982,7 @@
         </w:numPr>
       </w:pPr>
       <w:r>
-        <w:rPr>
-          <w:b/>
-          <w:bCs/>
-        </w:rPr>
-        <w:t>Portal do Contribuinte</w:t>
+        <w:t>CDA;</w:t>
       </w:r>
     </w:p>
     <w:p>
@@ -12993,11 +12993,7 @@
         </w:numPr>
       </w:pPr>
       <w:r>
-        <w:rPr>
-          <w:b/>
-          <w:bCs/>
-        </w:rPr>
-        <w:t>Parâmetros</w:t>
+        <w:t>certidões;</w:t>
       </w:r>
     </w:p>
     <w:p>
@@ -13008,11 +13004,7 @@
         </w:numPr>
       </w:pPr>
       <w:r>
-        <w:rPr>
-          <w:b/>
-          <w:bCs/>
-        </w:rPr>
-        <w:t>Relatórios</w:t>
+        <w:t>fiscalização;</w:t>
       </w:r>
     </w:p>
     <w:p>
@@ -13023,301 +13015,51 @@
         </w:numPr>
       </w:pPr>
       <w:r>
-        <w:rPr>
-          <w:b/>
-          <w:bCs/>
-        </w:rPr>
-        <w:t>Auditoria</w:t>
-      </w:r>
-    </w:p>
-    <w:p>
-      <w:r>
-        <w:pict w14:anchorId="39D3E09A">
-          <v:rect id="_x0000_i1283" style="width:0;height:1.5pt" o:hralign="center" o:hrstd="t" o:hr="t" fillcolor="#a0a0a0" stroked="f"/>
-        </w:pict>
-      </w:r>
-    </w:p>
-    <w:p>
-      <w:pPr>
-        <w:rPr>
-          <w:b/>
-          <w:bCs/>
-        </w:rPr>
-      </w:pPr>
-      <w:r>
-        <w:rPr>
-          <w:b/>
-          <w:bCs/>
-        </w:rPr>
+        <w:t>autos de infração;</w:t>
+      </w:r>
+    </w:p>
+    <w:p>
+      <w:pPr>
+        <w:numPr>
+          <w:ilvl w:val="0"/>
+          <w:numId w:val="84"/>
+        </w:numPr>
+      </w:pPr>
+      <w:r>
+        <w:t>processos tributários;</w:t>
+      </w:r>
+    </w:p>
+    <w:p>
+      <w:pPr>
+        <w:numPr>
+          <w:ilvl w:val="0"/>
+          <w:numId w:val="84"/>
+        </w:numPr>
+      </w:pPr>
+      <w:r>
+        <w:t>portal do contribuinte;</w:t>
+      </w:r>
+    </w:p>
+    <w:p>
+      <w:pPr>
+        <w:numPr>
+          <w:ilvl w:val="0"/>
+          <w:numId w:val="84"/>
+        </w:numPr>
+      </w:pPr>
+      <w:r>
+        <w:t>relatórios;</w:t>
+      </w:r>
+    </w:p>
+    <w:p>
+      <w:pPr>
+        <w:numPr>
+          <w:ilvl w:val="0"/>
+          <w:numId w:val="84"/>
+        </w:numPr>
+      </w:pPr>
+      <w:r>
         <w:lastRenderedPageBreak/>
-        <w:t>Resumo prático</w:t>
-      </w:r>
-    </w:p>
-    <w:p>
-      <w:r>
-        <w:t xml:space="preserve">O </w:t>
-      </w:r>
-      <w:r>
-        <w:rPr>
-          <w:b/>
-          <w:bCs/>
-        </w:rPr>
-        <w:t>Módulo 7 — Tributário</w:t>
-      </w:r>
-      <w:r>
-        <w:t xml:space="preserve"> deve cuidar de:</w:t>
-      </w:r>
-    </w:p>
-    <w:p>
-      <w:pPr>
-        <w:numPr>
-          <w:ilvl w:val="0"/>
-          <w:numId w:val="85"/>
-        </w:numPr>
-      </w:pPr>
-      <w:r>
-        <w:t>contribuintes;</w:t>
-      </w:r>
-    </w:p>
-    <w:p>
-      <w:pPr>
-        <w:numPr>
-          <w:ilvl w:val="0"/>
-          <w:numId w:val="85"/>
-        </w:numPr>
-      </w:pPr>
-      <w:r>
-        <w:t>imóveis fiscais;</w:t>
-      </w:r>
-    </w:p>
-    <w:p>
-      <w:pPr>
-        <w:numPr>
-          <w:ilvl w:val="0"/>
-          <w:numId w:val="85"/>
-        </w:numPr>
-      </w:pPr>
-      <w:r>
-        <w:t>empresas e inscrições municipais;</w:t>
-      </w:r>
-    </w:p>
-    <w:p>
-      <w:pPr>
-        <w:numPr>
-          <w:ilvl w:val="0"/>
-          <w:numId w:val="85"/>
-        </w:numPr>
-      </w:pPr>
-      <w:r>
-        <w:t>IPTU;</w:t>
-      </w:r>
-    </w:p>
-    <w:p>
-      <w:pPr>
-        <w:numPr>
-          <w:ilvl w:val="0"/>
-          <w:numId w:val="85"/>
-        </w:numPr>
-      </w:pPr>
-      <w:r>
-        <w:t>ITBI;</w:t>
-      </w:r>
-    </w:p>
-    <w:p>
-      <w:pPr>
-        <w:numPr>
-          <w:ilvl w:val="0"/>
-          <w:numId w:val="85"/>
-        </w:numPr>
-      </w:pPr>
-      <w:r>
-        <w:t>ISS;</w:t>
-      </w:r>
-    </w:p>
-    <w:p>
-      <w:pPr>
-        <w:numPr>
-          <w:ilvl w:val="0"/>
-          <w:numId w:val="85"/>
-        </w:numPr>
-      </w:pPr>
-      <w:r>
-        <w:t>NFS-e;</w:t>
-      </w:r>
-    </w:p>
-    <w:p>
-      <w:pPr>
-        <w:numPr>
-          <w:ilvl w:val="0"/>
-          <w:numId w:val="85"/>
-        </w:numPr>
-      </w:pPr>
-      <w:r>
-        <w:t>taxas municipais;</w:t>
-      </w:r>
-    </w:p>
-    <w:p>
-      <w:pPr>
-        <w:numPr>
-          <w:ilvl w:val="0"/>
-          <w:numId w:val="85"/>
-        </w:numPr>
-      </w:pPr>
-      <w:r>
-        <w:t>alvarás;</w:t>
-      </w:r>
-    </w:p>
-    <w:p>
-      <w:pPr>
-        <w:numPr>
-          <w:ilvl w:val="0"/>
-          <w:numId w:val="85"/>
-        </w:numPr>
-      </w:pPr>
-      <w:r>
-        <w:t>emissão de guias;</w:t>
-      </w:r>
-    </w:p>
-    <w:p>
-      <w:pPr>
-        <w:numPr>
-          <w:ilvl w:val="0"/>
-          <w:numId w:val="85"/>
-        </w:numPr>
-      </w:pPr>
-      <w:r>
-        <w:t>pagamentos;</w:t>
-      </w:r>
-    </w:p>
-    <w:p>
-      <w:pPr>
-        <w:numPr>
-          <w:ilvl w:val="0"/>
-          <w:numId w:val="85"/>
-        </w:numPr>
-      </w:pPr>
-      <w:r>
-        <w:t>baixas;</w:t>
-      </w:r>
-    </w:p>
-    <w:p>
-      <w:pPr>
-        <w:numPr>
-          <w:ilvl w:val="0"/>
-          <w:numId w:val="85"/>
-        </w:numPr>
-      </w:pPr>
-      <w:r>
-        <w:t>PIX/boleto/CNAB;</w:t>
-      </w:r>
-    </w:p>
-    <w:p>
-      <w:pPr>
-        <w:numPr>
-          <w:ilvl w:val="0"/>
-          <w:numId w:val="85"/>
-        </w:numPr>
-      </w:pPr>
-      <w:r>
-        <w:t>parcelamentos;</w:t>
-      </w:r>
-    </w:p>
-    <w:p>
-      <w:pPr>
-        <w:numPr>
-          <w:ilvl w:val="0"/>
-          <w:numId w:val="85"/>
-        </w:numPr>
-      </w:pPr>
-      <w:r>
-        <w:t>dívida ativa;</w:t>
-      </w:r>
-    </w:p>
-    <w:p>
-      <w:pPr>
-        <w:numPr>
-          <w:ilvl w:val="0"/>
-          <w:numId w:val="85"/>
-        </w:numPr>
-      </w:pPr>
-      <w:r>
-        <w:t>CDA;</w:t>
-      </w:r>
-    </w:p>
-    <w:p>
-      <w:pPr>
-        <w:numPr>
-          <w:ilvl w:val="0"/>
-          <w:numId w:val="85"/>
-        </w:numPr>
-      </w:pPr>
-      <w:r>
-        <w:t>certidões;</w:t>
-      </w:r>
-    </w:p>
-    <w:p>
-      <w:pPr>
-        <w:numPr>
-          <w:ilvl w:val="0"/>
-          <w:numId w:val="85"/>
-        </w:numPr>
-      </w:pPr>
-      <w:r>
-        <w:t>fiscalização;</w:t>
-      </w:r>
-    </w:p>
-    <w:p>
-      <w:pPr>
-        <w:numPr>
-          <w:ilvl w:val="0"/>
-          <w:numId w:val="85"/>
-        </w:numPr>
-      </w:pPr>
-      <w:r>
-        <w:t>autos de infração;</w:t>
-      </w:r>
-    </w:p>
-    <w:p>
-      <w:pPr>
-        <w:numPr>
-          <w:ilvl w:val="0"/>
-          <w:numId w:val="85"/>
-        </w:numPr>
-      </w:pPr>
-      <w:r>
-        <w:t>processos tributários;</w:t>
-      </w:r>
-    </w:p>
-    <w:p>
-      <w:pPr>
-        <w:numPr>
-          <w:ilvl w:val="0"/>
-          <w:numId w:val="85"/>
-        </w:numPr>
-      </w:pPr>
-      <w:r>
-        <w:t>portal do contribuinte;</w:t>
-      </w:r>
-    </w:p>
-    <w:p>
-      <w:pPr>
-        <w:numPr>
-          <w:ilvl w:val="0"/>
-          <w:numId w:val="85"/>
-        </w:numPr>
-      </w:pPr>
-      <w:r>
-        <w:t>relatórios;</w:t>
-      </w:r>
-    </w:p>
-    <w:p>
-      <w:pPr>
-        <w:numPr>
-          <w:ilvl w:val="0"/>
-          <w:numId w:val="85"/>
-        </w:numPr>
-      </w:pPr>
-      <w:r>
         <w:t>auditoria.</w:t>
       </w:r>
     </w:p>
@@ -17044,155 +16786,6 @@
     </w:lvl>
   </w:abstractNum>
   <w:abstractNum w:abstractNumId="25" w15:restartNumberingAfterBreak="0">
-    <w:nsid w:val="294F6450"/>
-    <w:multiLevelType w:val="multilevel"/>
-    <w:tmpl w:val="3754231E"/>
-    <w:lvl w:ilvl="0">
-      <w:start w:val="1"/>
-      <w:numFmt w:val="bullet"/>
-      <w:lvlText w:val=""/>
-      <w:lvlJc w:val="left"/>
-      <w:pPr>
-        <w:tabs>
-          <w:tab w:val="num" w:pos="720"/>
-        </w:tabs>
-        <w:ind w:left="720" w:hanging="360"/>
-      </w:pPr>
-      <w:rPr>
-        <w:rFonts w:ascii="Symbol" w:hAnsi="Symbol" w:hint="default"/>
-        <w:sz w:val="20"/>
-      </w:rPr>
-    </w:lvl>
-    <w:lvl w:ilvl="1" w:tentative="1">
-      <w:start w:val="1"/>
-      <w:numFmt w:val="bullet"/>
-      <w:lvlText w:val="o"/>
-      <w:lvlJc w:val="left"/>
-      <w:pPr>
-        <w:tabs>
-          <w:tab w:val="num" w:pos="1440"/>
-        </w:tabs>
-        <w:ind w:left="1440" w:hanging="360"/>
-      </w:pPr>
-      <w:rPr>
-        <w:rFonts w:ascii="Courier New" w:hAnsi="Courier New" w:hint="default"/>
-        <w:sz w:val="20"/>
-      </w:rPr>
-    </w:lvl>
-    <w:lvl w:ilvl="2" w:tentative="1">
-      <w:start w:val="1"/>
-      <w:numFmt w:val="bullet"/>
-      <w:lvlText w:val=""/>
-      <w:lvlJc w:val="left"/>
-      <w:pPr>
-        <w:tabs>
-          <w:tab w:val="num" w:pos="2160"/>
-        </w:tabs>
-        <w:ind w:left="2160" w:hanging="360"/>
-      </w:pPr>
-      <w:rPr>
-        <w:rFonts w:ascii="Wingdings" w:hAnsi="Wingdings" w:hint="default"/>
-        <w:sz w:val="20"/>
-      </w:rPr>
-    </w:lvl>
-    <w:lvl w:ilvl="3" w:tentative="1">
-      <w:start w:val="1"/>
-      <w:numFmt w:val="bullet"/>
-      <w:lvlText w:val=""/>
-      <w:lvlJc w:val="left"/>
-      <w:pPr>
-        <w:tabs>
-          <w:tab w:val="num" w:pos="2880"/>
-        </w:tabs>
-        <w:ind w:left="2880" w:hanging="360"/>
-      </w:pPr>
-      <w:rPr>
-        <w:rFonts w:ascii="Wingdings" w:hAnsi="Wingdings" w:hint="default"/>
-        <w:sz w:val="20"/>
-      </w:rPr>
-    </w:lvl>
-    <w:lvl w:ilvl="4" w:tentative="1">
-      <w:start w:val="1"/>
-      <w:numFmt w:val="bullet"/>
-      <w:lvlText w:val=""/>
-      <w:lvlJc w:val="left"/>
-      <w:pPr>
-        <w:tabs>
-          <w:tab w:val="num" w:pos="3600"/>
-        </w:tabs>
-        <w:ind w:left="3600" w:hanging="360"/>
-      </w:pPr>
-      <w:rPr>
-        <w:rFonts w:ascii="Wingdings" w:hAnsi="Wingdings" w:hint="default"/>
-        <w:sz w:val="20"/>
-      </w:rPr>
-    </w:lvl>
-    <w:lvl w:ilvl="5" w:tentative="1">
-      <w:start w:val="1"/>
-      <w:numFmt w:val="bullet"/>
-      <w:lvlText w:val=""/>
-      <w:lvlJc w:val="left"/>
-      <w:pPr>
-        <w:tabs>
-          <w:tab w:val="num" w:pos="4320"/>
-        </w:tabs>
-        <w:ind w:left="4320" w:hanging="360"/>
-      </w:pPr>
-      <w:rPr>
-        <w:rFonts w:ascii="Wingdings" w:hAnsi="Wingdings" w:hint="default"/>
-        <w:sz w:val="20"/>
-      </w:rPr>
-    </w:lvl>
-    <w:lvl w:ilvl="6" w:tentative="1">
-      <w:start w:val="1"/>
-      <w:numFmt w:val="bullet"/>
-      <w:lvlText w:val=""/>
-      <w:lvlJc w:val="left"/>
-      <w:pPr>
-        <w:tabs>
-          <w:tab w:val="num" w:pos="5040"/>
-        </w:tabs>
-        <w:ind w:left="5040" w:hanging="360"/>
-      </w:pPr>
-      <w:rPr>
-        <w:rFonts w:ascii="Wingdings" w:hAnsi="Wingdings" w:hint="default"/>
-        <w:sz w:val="20"/>
-      </w:rPr>
-    </w:lvl>
-    <w:lvl w:ilvl="7" w:tentative="1">
-      <w:start w:val="1"/>
-      <w:numFmt w:val="bullet"/>
-      <w:lvlText w:val=""/>
-      <w:lvlJc w:val="left"/>
-      <w:pPr>
-        <w:tabs>
-          <w:tab w:val="num" w:pos="5760"/>
-        </w:tabs>
-        <w:ind w:left="5760" w:hanging="360"/>
-      </w:pPr>
-      <w:rPr>
-        <w:rFonts w:ascii="Wingdings" w:hAnsi="Wingdings" w:hint="default"/>
-        <w:sz w:val="20"/>
-      </w:rPr>
-    </w:lvl>
-    <w:lvl w:ilvl="8" w:tentative="1">
-      <w:start w:val="1"/>
-      <w:numFmt w:val="bullet"/>
-      <w:lvlText w:val=""/>
-      <w:lvlJc w:val="left"/>
-      <w:pPr>
-        <w:tabs>
-          <w:tab w:val="num" w:pos="6480"/>
-        </w:tabs>
-        <w:ind w:left="6480" w:hanging="360"/>
-      </w:pPr>
-      <w:rPr>
-        <w:rFonts w:ascii="Wingdings" w:hAnsi="Wingdings" w:hint="default"/>
-        <w:sz w:val="20"/>
-      </w:rPr>
-    </w:lvl>
-  </w:abstractNum>
-  <w:abstractNum w:abstractNumId="26" w15:restartNumberingAfterBreak="0">
     <w:nsid w:val="2A843F2E"/>
     <w:multiLevelType w:val="multilevel"/>
     <w:tmpl w:val="2C365F72"/>
@@ -17341,7 +16934,7 @@
       </w:rPr>
     </w:lvl>
   </w:abstractNum>
-  <w:abstractNum w:abstractNumId="27" w15:restartNumberingAfterBreak="0">
+  <w:abstractNum w:abstractNumId="26" w15:restartNumberingAfterBreak="0">
     <w:nsid w:val="2C76538E"/>
     <w:multiLevelType w:val="multilevel"/>
     <w:tmpl w:val="6D34DE46"/>
@@ -17490,7 +17083,7 @@
       </w:rPr>
     </w:lvl>
   </w:abstractNum>
-  <w:abstractNum w:abstractNumId="28" w15:restartNumberingAfterBreak="0">
+  <w:abstractNum w:abstractNumId="27" w15:restartNumberingAfterBreak="0">
     <w:nsid w:val="2ED43FF5"/>
     <w:multiLevelType w:val="multilevel"/>
     <w:tmpl w:val="C14ACFDA"/>
@@ -17639,7 +17232,7 @@
       </w:rPr>
     </w:lvl>
   </w:abstractNum>
-  <w:abstractNum w:abstractNumId="29" w15:restartNumberingAfterBreak="0">
+  <w:abstractNum w:abstractNumId="28" w15:restartNumberingAfterBreak="0">
     <w:nsid w:val="315E18C3"/>
     <w:multiLevelType w:val="multilevel"/>
     <w:tmpl w:val="4CC8FCCC"/>
@@ -17752,7 +17345,7 @@
       </w:pPr>
     </w:lvl>
   </w:abstractNum>
-  <w:abstractNum w:abstractNumId="30" w15:restartNumberingAfterBreak="0">
+  <w:abstractNum w:abstractNumId="29" w15:restartNumberingAfterBreak="0">
     <w:nsid w:val="31E54D22"/>
     <w:multiLevelType w:val="multilevel"/>
     <w:tmpl w:val="9112C20C"/>
@@ -17901,7 +17494,7 @@
       </w:rPr>
     </w:lvl>
   </w:abstractNum>
-  <w:abstractNum w:abstractNumId="31" w15:restartNumberingAfterBreak="0">
+  <w:abstractNum w:abstractNumId="30" w15:restartNumberingAfterBreak="0">
     <w:nsid w:val="32E41061"/>
     <w:multiLevelType w:val="multilevel"/>
     <w:tmpl w:val="F334D55A"/>
@@ -18014,7 +17607,7 @@
       </w:pPr>
     </w:lvl>
   </w:abstractNum>
-  <w:abstractNum w:abstractNumId="32" w15:restartNumberingAfterBreak="0">
+  <w:abstractNum w:abstractNumId="31" w15:restartNumberingAfterBreak="0">
     <w:nsid w:val="33021621"/>
     <w:multiLevelType w:val="multilevel"/>
     <w:tmpl w:val="3132B70A"/>
@@ -18163,7 +17756,7 @@
       </w:rPr>
     </w:lvl>
   </w:abstractNum>
-  <w:abstractNum w:abstractNumId="33" w15:restartNumberingAfterBreak="0">
+  <w:abstractNum w:abstractNumId="32" w15:restartNumberingAfterBreak="0">
     <w:nsid w:val="33894348"/>
     <w:multiLevelType w:val="multilevel"/>
     <w:tmpl w:val="DE76F6BA"/>
@@ -18312,7 +17905,7 @@
       </w:rPr>
     </w:lvl>
   </w:abstractNum>
-  <w:abstractNum w:abstractNumId="34" w15:restartNumberingAfterBreak="0">
+  <w:abstractNum w:abstractNumId="33" w15:restartNumberingAfterBreak="0">
     <w:nsid w:val="340260BD"/>
     <w:multiLevelType w:val="multilevel"/>
     <w:tmpl w:val="05D8A140"/>
@@ -18461,7 +18054,7 @@
       </w:rPr>
     </w:lvl>
   </w:abstractNum>
-  <w:abstractNum w:abstractNumId="35" w15:restartNumberingAfterBreak="0">
+  <w:abstractNum w:abstractNumId="34" w15:restartNumberingAfterBreak="0">
     <w:nsid w:val="34AB54D5"/>
     <w:multiLevelType w:val="multilevel"/>
     <w:tmpl w:val="48F2EA62"/>
@@ -18610,7 +18203,7 @@
       </w:rPr>
     </w:lvl>
   </w:abstractNum>
-  <w:abstractNum w:abstractNumId="36" w15:restartNumberingAfterBreak="0">
+  <w:abstractNum w:abstractNumId="35" w15:restartNumberingAfterBreak="0">
     <w:nsid w:val="363843E7"/>
     <w:multiLevelType w:val="multilevel"/>
     <w:tmpl w:val="57F27438"/>
@@ -18759,7 +18352,7 @@
       </w:rPr>
     </w:lvl>
   </w:abstractNum>
-  <w:abstractNum w:abstractNumId="37" w15:restartNumberingAfterBreak="0">
+  <w:abstractNum w:abstractNumId="36" w15:restartNumberingAfterBreak="0">
     <w:nsid w:val="3A940822"/>
     <w:multiLevelType w:val="multilevel"/>
     <w:tmpl w:val="7BC4774E"/>
@@ -18908,7 +18501,7 @@
       </w:rPr>
     </w:lvl>
   </w:abstractNum>
-  <w:abstractNum w:abstractNumId="38" w15:restartNumberingAfterBreak="0">
+  <w:abstractNum w:abstractNumId="37" w15:restartNumberingAfterBreak="0">
     <w:nsid w:val="3B294688"/>
     <w:multiLevelType w:val="multilevel"/>
     <w:tmpl w:val="06A07F94"/>
@@ -19057,7 +18650,7 @@
       </w:rPr>
     </w:lvl>
   </w:abstractNum>
-  <w:abstractNum w:abstractNumId="39" w15:restartNumberingAfterBreak="0">
+  <w:abstractNum w:abstractNumId="38" w15:restartNumberingAfterBreak="0">
     <w:nsid w:val="3CDD3BE5"/>
     <w:multiLevelType w:val="multilevel"/>
     <w:tmpl w:val="F2ECCC98"/>
@@ -19206,7 +18799,7 @@
       </w:rPr>
     </w:lvl>
   </w:abstractNum>
-  <w:abstractNum w:abstractNumId="40" w15:restartNumberingAfterBreak="0">
+  <w:abstractNum w:abstractNumId="39" w15:restartNumberingAfterBreak="0">
     <w:nsid w:val="3D5823DE"/>
     <w:multiLevelType w:val="multilevel"/>
     <w:tmpl w:val="6982266A"/>
@@ -19319,7 +18912,7 @@
       </w:pPr>
     </w:lvl>
   </w:abstractNum>
-  <w:abstractNum w:abstractNumId="41" w15:restartNumberingAfterBreak="0">
+  <w:abstractNum w:abstractNumId="40" w15:restartNumberingAfterBreak="0">
     <w:nsid w:val="3F002B8A"/>
     <w:multiLevelType w:val="multilevel"/>
     <w:tmpl w:val="18BC38A8"/>
@@ -19468,7 +19061,7 @@
       </w:rPr>
     </w:lvl>
   </w:abstractNum>
-  <w:abstractNum w:abstractNumId="42" w15:restartNumberingAfterBreak="0">
+  <w:abstractNum w:abstractNumId="41" w15:restartNumberingAfterBreak="0">
     <w:nsid w:val="40425603"/>
     <w:multiLevelType w:val="multilevel"/>
     <w:tmpl w:val="FBE04280"/>
@@ -19617,7 +19210,7 @@
       </w:rPr>
     </w:lvl>
   </w:abstractNum>
-  <w:abstractNum w:abstractNumId="43" w15:restartNumberingAfterBreak="0">
+  <w:abstractNum w:abstractNumId="42" w15:restartNumberingAfterBreak="0">
     <w:nsid w:val="404604F6"/>
     <w:multiLevelType w:val="multilevel"/>
     <w:tmpl w:val="ECEA6330"/>
@@ -19766,7 +19359,7 @@
       </w:rPr>
     </w:lvl>
   </w:abstractNum>
-  <w:abstractNum w:abstractNumId="44" w15:restartNumberingAfterBreak="0">
+  <w:abstractNum w:abstractNumId="43" w15:restartNumberingAfterBreak="0">
     <w:nsid w:val="405D6EB4"/>
     <w:multiLevelType w:val="multilevel"/>
     <w:tmpl w:val="7F88F404"/>
@@ -19915,7 +19508,7 @@
       </w:rPr>
     </w:lvl>
   </w:abstractNum>
-  <w:abstractNum w:abstractNumId="45" w15:restartNumberingAfterBreak="0">
+  <w:abstractNum w:abstractNumId="44" w15:restartNumberingAfterBreak="0">
     <w:nsid w:val="42895078"/>
     <w:multiLevelType w:val="multilevel"/>
     <w:tmpl w:val="B9686630"/>
@@ -20064,7 +19657,7 @@
       </w:rPr>
     </w:lvl>
   </w:abstractNum>
-  <w:abstractNum w:abstractNumId="46" w15:restartNumberingAfterBreak="0">
+  <w:abstractNum w:abstractNumId="45" w15:restartNumberingAfterBreak="0">
     <w:nsid w:val="42A745DB"/>
     <w:multiLevelType w:val="multilevel"/>
     <w:tmpl w:val="2716F52A"/>
@@ -20213,7 +19806,7 @@
       </w:rPr>
     </w:lvl>
   </w:abstractNum>
-  <w:abstractNum w:abstractNumId="47" w15:restartNumberingAfterBreak="0">
+  <w:abstractNum w:abstractNumId="46" w15:restartNumberingAfterBreak="0">
     <w:nsid w:val="42EA44B5"/>
     <w:multiLevelType w:val="multilevel"/>
     <w:tmpl w:val="39C0FE02"/>
@@ -20362,7 +19955,7 @@
       </w:rPr>
     </w:lvl>
   </w:abstractNum>
-  <w:abstractNum w:abstractNumId="48" w15:restartNumberingAfterBreak="0">
+  <w:abstractNum w:abstractNumId="47" w15:restartNumberingAfterBreak="0">
     <w:nsid w:val="44D56D3E"/>
     <w:multiLevelType w:val="multilevel"/>
     <w:tmpl w:val="4656D1B4"/>
@@ -20511,7 +20104,7 @@
       </w:rPr>
     </w:lvl>
   </w:abstractNum>
-  <w:abstractNum w:abstractNumId="49" w15:restartNumberingAfterBreak="0">
+  <w:abstractNum w:abstractNumId="48" w15:restartNumberingAfterBreak="0">
     <w:nsid w:val="44E956D8"/>
     <w:multiLevelType w:val="multilevel"/>
     <w:tmpl w:val="AF026620"/>
@@ -20660,7 +20253,7 @@
       </w:rPr>
     </w:lvl>
   </w:abstractNum>
-  <w:abstractNum w:abstractNumId="50" w15:restartNumberingAfterBreak="0">
+  <w:abstractNum w:abstractNumId="49" w15:restartNumberingAfterBreak="0">
     <w:nsid w:val="4A394138"/>
     <w:multiLevelType w:val="multilevel"/>
     <w:tmpl w:val="8418FE7A"/>
@@ -20773,7 +20366,7 @@
       </w:pPr>
     </w:lvl>
   </w:abstractNum>
-  <w:abstractNum w:abstractNumId="51" w15:restartNumberingAfterBreak="0">
+  <w:abstractNum w:abstractNumId="50" w15:restartNumberingAfterBreak="0">
     <w:nsid w:val="4C6041E6"/>
     <w:multiLevelType w:val="multilevel"/>
     <w:tmpl w:val="C3F4DFD4"/>
@@ -20922,7 +20515,7 @@
       </w:rPr>
     </w:lvl>
   </w:abstractNum>
-  <w:abstractNum w:abstractNumId="52" w15:restartNumberingAfterBreak="0">
+  <w:abstractNum w:abstractNumId="51" w15:restartNumberingAfterBreak="0">
     <w:nsid w:val="4C6C054D"/>
     <w:multiLevelType w:val="multilevel"/>
     <w:tmpl w:val="FEC8078E"/>
@@ -21071,7 +20664,7 @@
       </w:rPr>
     </w:lvl>
   </w:abstractNum>
-  <w:abstractNum w:abstractNumId="53" w15:restartNumberingAfterBreak="0">
+  <w:abstractNum w:abstractNumId="52" w15:restartNumberingAfterBreak="0">
     <w:nsid w:val="4F9255FB"/>
     <w:multiLevelType w:val="multilevel"/>
     <w:tmpl w:val="A75C1B98"/>
@@ -21220,7 +20813,7 @@
       </w:rPr>
     </w:lvl>
   </w:abstractNum>
-  <w:abstractNum w:abstractNumId="54" w15:restartNumberingAfterBreak="0">
+  <w:abstractNum w:abstractNumId="53" w15:restartNumberingAfterBreak="0">
     <w:nsid w:val="4FBB7DD8"/>
     <w:multiLevelType w:val="multilevel"/>
     <w:tmpl w:val="46EE9F1E"/>
@@ -21369,7 +20962,7 @@
       </w:rPr>
     </w:lvl>
   </w:abstractNum>
-  <w:abstractNum w:abstractNumId="55" w15:restartNumberingAfterBreak="0">
+  <w:abstractNum w:abstractNumId="54" w15:restartNumberingAfterBreak="0">
     <w:nsid w:val="4FE67F8B"/>
     <w:multiLevelType w:val="multilevel"/>
     <w:tmpl w:val="AADE9DDE"/>
@@ -21518,7 +21111,7 @@
       </w:rPr>
     </w:lvl>
   </w:abstractNum>
-  <w:abstractNum w:abstractNumId="56" w15:restartNumberingAfterBreak="0">
+  <w:abstractNum w:abstractNumId="55" w15:restartNumberingAfterBreak="0">
     <w:nsid w:val="50174A5A"/>
     <w:multiLevelType w:val="multilevel"/>
     <w:tmpl w:val="6B7A8C56"/>
@@ -21667,7 +21260,7 @@
       </w:rPr>
     </w:lvl>
   </w:abstractNum>
-  <w:abstractNum w:abstractNumId="57" w15:restartNumberingAfterBreak="0">
+  <w:abstractNum w:abstractNumId="56" w15:restartNumberingAfterBreak="0">
     <w:nsid w:val="512A094A"/>
     <w:multiLevelType w:val="multilevel"/>
     <w:tmpl w:val="3EC80C16"/>
@@ -21816,7 +21409,7 @@
       </w:rPr>
     </w:lvl>
   </w:abstractNum>
-  <w:abstractNum w:abstractNumId="58" w15:restartNumberingAfterBreak="0">
+  <w:abstractNum w:abstractNumId="57" w15:restartNumberingAfterBreak="0">
     <w:nsid w:val="52A4146A"/>
     <w:multiLevelType w:val="multilevel"/>
     <w:tmpl w:val="A56E0992"/>
@@ -21965,7 +21558,7 @@
       </w:rPr>
     </w:lvl>
   </w:abstractNum>
-  <w:abstractNum w:abstractNumId="59" w15:restartNumberingAfterBreak="0">
+  <w:abstractNum w:abstractNumId="58" w15:restartNumberingAfterBreak="0">
     <w:nsid w:val="532465CA"/>
     <w:multiLevelType w:val="multilevel"/>
     <w:tmpl w:val="8D5C9A70"/>
@@ -22114,7 +21707,7 @@
       </w:rPr>
     </w:lvl>
   </w:abstractNum>
-  <w:abstractNum w:abstractNumId="60" w15:restartNumberingAfterBreak="0">
+  <w:abstractNum w:abstractNumId="59" w15:restartNumberingAfterBreak="0">
     <w:nsid w:val="536B7A60"/>
     <w:multiLevelType w:val="multilevel"/>
     <w:tmpl w:val="23E8F496"/>
@@ -22263,7 +21856,7 @@
       </w:rPr>
     </w:lvl>
   </w:abstractNum>
-  <w:abstractNum w:abstractNumId="61" w15:restartNumberingAfterBreak="0">
+  <w:abstractNum w:abstractNumId="60" w15:restartNumberingAfterBreak="0">
     <w:nsid w:val="5577006D"/>
     <w:multiLevelType w:val="multilevel"/>
     <w:tmpl w:val="0C743F62"/>
@@ -22412,7 +22005,7 @@
       </w:rPr>
     </w:lvl>
   </w:abstractNum>
-  <w:abstractNum w:abstractNumId="62" w15:restartNumberingAfterBreak="0">
+  <w:abstractNum w:abstractNumId="61" w15:restartNumberingAfterBreak="0">
     <w:nsid w:val="59584EE3"/>
     <w:multiLevelType w:val="multilevel"/>
     <w:tmpl w:val="5490AE14"/>
@@ -22561,7 +22154,7 @@
       </w:rPr>
     </w:lvl>
   </w:abstractNum>
-  <w:abstractNum w:abstractNumId="63" w15:restartNumberingAfterBreak="0">
+  <w:abstractNum w:abstractNumId="62" w15:restartNumberingAfterBreak="0">
     <w:nsid w:val="59BD7329"/>
     <w:multiLevelType w:val="multilevel"/>
     <w:tmpl w:val="57107344"/>
@@ -22710,7 +22303,7 @@
       </w:rPr>
     </w:lvl>
   </w:abstractNum>
-  <w:abstractNum w:abstractNumId="64" w15:restartNumberingAfterBreak="0">
+  <w:abstractNum w:abstractNumId="63" w15:restartNumberingAfterBreak="0">
     <w:nsid w:val="5A9E2F13"/>
     <w:multiLevelType w:val="multilevel"/>
     <w:tmpl w:val="301A9D8C"/>
@@ -22859,7 +22452,7 @@
       </w:rPr>
     </w:lvl>
   </w:abstractNum>
-  <w:abstractNum w:abstractNumId="65" w15:restartNumberingAfterBreak="0">
+  <w:abstractNum w:abstractNumId="64" w15:restartNumberingAfterBreak="0">
     <w:nsid w:val="5AEE1BAB"/>
     <w:multiLevelType w:val="multilevel"/>
     <w:tmpl w:val="487043D0"/>
@@ -22972,7 +22565,7 @@
       </w:pPr>
     </w:lvl>
   </w:abstractNum>
-  <w:abstractNum w:abstractNumId="66" w15:restartNumberingAfterBreak="0">
+  <w:abstractNum w:abstractNumId="65" w15:restartNumberingAfterBreak="0">
     <w:nsid w:val="5C0913B0"/>
     <w:multiLevelType w:val="multilevel"/>
     <w:tmpl w:val="F04085C8"/>
@@ -23121,7 +22714,7 @@
       </w:rPr>
     </w:lvl>
   </w:abstractNum>
-  <w:abstractNum w:abstractNumId="67" w15:restartNumberingAfterBreak="0">
+  <w:abstractNum w:abstractNumId="66" w15:restartNumberingAfterBreak="0">
     <w:nsid w:val="5D5B374D"/>
     <w:multiLevelType w:val="multilevel"/>
     <w:tmpl w:val="9572C988"/>
@@ -23270,7 +22863,7 @@
       </w:rPr>
     </w:lvl>
   </w:abstractNum>
-  <w:abstractNum w:abstractNumId="68" w15:restartNumberingAfterBreak="0">
+  <w:abstractNum w:abstractNumId="67" w15:restartNumberingAfterBreak="0">
     <w:nsid w:val="5F24276B"/>
     <w:multiLevelType w:val="multilevel"/>
     <w:tmpl w:val="EC446DC4"/>
@@ -23419,7 +23012,7 @@
       </w:rPr>
     </w:lvl>
   </w:abstractNum>
-  <w:abstractNum w:abstractNumId="69" w15:restartNumberingAfterBreak="0">
+  <w:abstractNum w:abstractNumId="68" w15:restartNumberingAfterBreak="0">
     <w:nsid w:val="5F307B88"/>
     <w:multiLevelType w:val="multilevel"/>
     <w:tmpl w:val="E36EB756"/>
@@ -23568,7 +23161,7 @@
       </w:rPr>
     </w:lvl>
   </w:abstractNum>
-  <w:abstractNum w:abstractNumId="70" w15:restartNumberingAfterBreak="0">
+  <w:abstractNum w:abstractNumId="69" w15:restartNumberingAfterBreak="0">
     <w:nsid w:val="60CD547A"/>
     <w:multiLevelType w:val="multilevel"/>
     <w:tmpl w:val="4DE493EE"/>
@@ -23717,7 +23310,7 @@
       </w:rPr>
     </w:lvl>
   </w:abstractNum>
-  <w:abstractNum w:abstractNumId="71" w15:restartNumberingAfterBreak="0">
+  <w:abstractNum w:abstractNumId="70" w15:restartNumberingAfterBreak="0">
     <w:nsid w:val="63AF7C16"/>
     <w:multiLevelType w:val="multilevel"/>
     <w:tmpl w:val="53D21DFE"/>
@@ -23866,7 +23459,7 @@
       </w:rPr>
     </w:lvl>
   </w:abstractNum>
-  <w:abstractNum w:abstractNumId="72" w15:restartNumberingAfterBreak="0">
+  <w:abstractNum w:abstractNumId="71" w15:restartNumberingAfterBreak="0">
     <w:nsid w:val="687E0106"/>
     <w:multiLevelType w:val="multilevel"/>
     <w:tmpl w:val="D5D27738"/>
@@ -24015,7 +23608,7 @@
       </w:rPr>
     </w:lvl>
   </w:abstractNum>
-  <w:abstractNum w:abstractNumId="73" w15:restartNumberingAfterBreak="0">
+  <w:abstractNum w:abstractNumId="72" w15:restartNumberingAfterBreak="0">
     <w:nsid w:val="68A41CE2"/>
     <w:multiLevelType w:val="multilevel"/>
     <w:tmpl w:val="67C67F1C"/>
@@ -24164,7 +23757,7 @@
       </w:rPr>
     </w:lvl>
   </w:abstractNum>
-  <w:abstractNum w:abstractNumId="74" w15:restartNumberingAfterBreak="0">
+  <w:abstractNum w:abstractNumId="73" w15:restartNumberingAfterBreak="0">
     <w:nsid w:val="71354A6F"/>
     <w:multiLevelType w:val="multilevel"/>
     <w:tmpl w:val="93966CDE"/>
@@ -24313,7 +23906,7 @@
       </w:rPr>
     </w:lvl>
   </w:abstractNum>
-  <w:abstractNum w:abstractNumId="75" w15:restartNumberingAfterBreak="0">
+  <w:abstractNum w:abstractNumId="74" w15:restartNumberingAfterBreak="0">
     <w:nsid w:val="725E572B"/>
     <w:multiLevelType w:val="multilevel"/>
     <w:tmpl w:val="8DEE4794"/>
@@ -24462,7 +24055,7 @@
       </w:rPr>
     </w:lvl>
   </w:abstractNum>
-  <w:abstractNum w:abstractNumId="76" w15:restartNumberingAfterBreak="0">
+  <w:abstractNum w:abstractNumId="75" w15:restartNumberingAfterBreak="0">
     <w:nsid w:val="727B317D"/>
     <w:multiLevelType w:val="multilevel"/>
     <w:tmpl w:val="857A04D0"/>
@@ -24611,7 +24204,7 @@
       </w:rPr>
     </w:lvl>
   </w:abstractNum>
-  <w:abstractNum w:abstractNumId="77" w15:restartNumberingAfterBreak="0">
+  <w:abstractNum w:abstractNumId="76" w15:restartNumberingAfterBreak="0">
     <w:nsid w:val="733B7184"/>
     <w:multiLevelType w:val="multilevel"/>
     <w:tmpl w:val="4926C8AE"/>
@@ -24760,7 +24353,7 @@
       </w:rPr>
     </w:lvl>
   </w:abstractNum>
-  <w:abstractNum w:abstractNumId="78" w15:restartNumberingAfterBreak="0">
+  <w:abstractNum w:abstractNumId="77" w15:restartNumberingAfterBreak="0">
     <w:nsid w:val="737B0AF6"/>
     <w:multiLevelType w:val="multilevel"/>
     <w:tmpl w:val="3C2011DE"/>
@@ -24909,7 +24502,7 @@
       </w:rPr>
     </w:lvl>
   </w:abstractNum>
-  <w:abstractNum w:abstractNumId="79" w15:restartNumberingAfterBreak="0">
+  <w:abstractNum w:abstractNumId="78" w15:restartNumberingAfterBreak="0">
     <w:nsid w:val="73E01891"/>
     <w:multiLevelType w:val="multilevel"/>
     <w:tmpl w:val="2A543620"/>
@@ -25058,7 +24651,7 @@
       </w:rPr>
     </w:lvl>
   </w:abstractNum>
-  <w:abstractNum w:abstractNumId="80" w15:restartNumberingAfterBreak="0">
+  <w:abstractNum w:abstractNumId="79" w15:restartNumberingAfterBreak="0">
     <w:nsid w:val="74F371D8"/>
     <w:multiLevelType w:val="multilevel"/>
     <w:tmpl w:val="861E9D7A"/>
@@ -25207,7 +24800,7 @@
       </w:rPr>
     </w:lvl>
   </w:abstractNum>
-  <w:abstractNum w:abstractNumId="81" w15:restartNumberingAfterBreak="0">
+  <w:abstractNum w:abstractNumId="80" w15:restartNumberingAfterBreak="0">
     <w:nsid w:val="74F772FD"/>
     <w:multiLevelType w:val="multilevel"/>
     <w:tmpl w:val="378A02CE"/>
@@ -25356,7 +24949,7 @@
       </w:rPr>
     </w:lvl>
   </w:abstractNum>
-  <w:abstractNum w:abstractNumId="82" w15:restartNumberingAfterBreak="0">
+  <w:abstractNum w:abstractNumId="81" w15:restartNumberingAfterBreak="0">
     <w:nsid w:val="785F13BE"/>
     <w:multiLevelType w:val="multilevel"/>
     <w:tmpl w:val="2618D5A2"/>
@@ -25505,7 +25098,7 @@
       </w:rPr>
     </w:lvl>
   </w:abstractNum>
-  <w:abstractNum w:abstractNumId="83" w15:restartNumberingAfterBreak="0">
+  <w:abstractNum w:abstractNumId="82" w15:restartNumberingAfterBreak="0">
     <w:nsid w:val="7A9F00C3"/>
     <w:multiLevelType w:val="multilevel"/>
     <w:tmpl w:val="EDA46106"/>
@@ -25654,7 +25247,7 @@
       </w:rPr>
     </w:lvl>
   </w:abstractNum>
-  <w:abstractNum w:abstractNumId="84" w15:restartNumberingAfterBreak="0">
+  <w:abstractNum w:abstractNumId="83" w15:restartNumberingAfterBreak="0">
     <w:nsid w:val="7C7C6339"/>
     <w:multiLevelType w:val="multilevel"/>
     <w:tmpl w:val="77DCCA34"/>
@@ -25804,49 +25397,49 @@
     </w:lvl>
   </w:abstractNum>
   <w:num w:numId="1" w16cid:durableId="991523016">
-    <w:abstractNumId w:val="37"/>
+    <w:abstractNumId w:val="36"/>
   </w:num>
   <w:num w:numId="2" w16cid:durableId="1937639415">
-    <w:abstractNumId w:val="79"/>
+    <w:abstractNumId w:val="78"/>
   </w:num>
   <w:num w:numId="3" w16cid:durableId="1723363317">
-    <w:abstractNumId w:val="55"/>
+    <w:abstractNumId w:val="54"/>
   </w:num>
   <w:num w:numId="4" w16cid:durableId="1153326778">
-    <w:abstractNumId w:val="70"/>
+    <w:abstractNumId w:val="69"/>
   </w:num>
   <w:num w:numId="5" w16cid:durableId="1805271526">
-    <w:abstractNumId w:val="65"/>
+    <w:abstractNumId w:val="64"/>
   </w:num>
   <w:num w:numId="6" w16cid:durableId="1510636114">
-    <w:abstractNumId w:val="73"/>
+    <w:abstractNumId w:val="72"/>
   </w:num>
   <w:num w:numId="7" w16cid:durableId="1532838441">
     <w:abstractNumId w:val="0"/>
   </w:num>
   <w:num w:numId="8" w16cid:durableId="908804315">
-    <w:abstractNumId w:val="77"/>
+    <w:abstractNumId w:val="76"/>
   </w:num>
   <w:num w:numId="9" w16cid:durableId="1326595511">
-    <w:abstractNumId w:val="58"/>
+    <w:abstractNumId w:val="57"/>
   </w:num>
   <w:num w:numId="10" w16cid:durableId="1005401553">
-    <w:abstractNumId w:val="48"/>
+    <w:abstractNumId w:val="47"/>
   </w:num>
   <w:num w:numId="11" w16cid:durableId="1227179437">
-    <w:abstractNumId w:val="64"/>
+    <w:abstractNumId w:val="63"/>
   </w:num>
   <w:num w:numId="12" w16cid:durableId="1033724786">
-    <w:abstractNumId w:val="34"/>
+    <w:abstractNumId w:val="33"/>
   </w:num>
   <w:num w:numId="13" w16cid:durableId="1902056162">
-    <w:abstractNumId w:val="67"/>
+    <w:abstractNumId w:val="66"/>
   </w:num>
   <w:num w:numId="14" w16cid:durableId="1562447269">
     <w:abstractNumId w:val="18"/>
   </w:num>
   <w:num w:numId="15" w16cid:durableId="694427899">
-    <w:abstractNumId w:val="28"/>
+    <w:abstractNumId w:val="27"/>
   </w:num>
   <w:num w:numId="16" w16cid:durableId="1535534917">
     <w:abstractNumId w:val="2"/>
@@ -25858,61 +25451,61 @@
     <w:abstractNumId w:val="15"/>
   </w:num>
   <w:num w:numId="19" w16cid:durableId="1728991402">
-    <w:abstractNumId w:val="27"/>
+    <w:abstractNumId w:val="26"/>
   </w:num>
   <w:num w:numId="20" w16cid:durableId="350573558">
-    <w:abstractNumId w:val="59"/>
+    <w:abstractNumId w:val="58"/>
   </w:num>
   <w:num w:numId="21" w16cid:durableId="777061697">
-    <w:abstractNumId w:val="56"/>
+    <w:abstractNumId w:val="55"/>
   </w:num>
   <w:num w:numId="22" w16cid:durableId="322008330">
-    <w:abstractNumId w:val="50"/>
+    <w:abstractNumId w:val="49"/>
   </w:num>
   <w:num w:numId="23" w16cid:durableId="2072001876">
-    <w:abstractNumId w:val="69"/>
+    <w:abstractNumId w:val="68"/>
   </w:num>
   <w:num w:numId="24" w16cid:durableId="1874541331">
-    <w:abstractNumId w:val="78"/>
+    <w:abstractNumId w:val="77"/>
   </w:num>
   <w:num w:numId="25" w16cid:durableId="245843056">
     <w:abstractNumId w:val="8"/>
   </w:num>
   <w:num w:numId="26" w16cid:durableId="1732271061">
-    <w:abstractNumId w:val="45"/>
+    <w:abstractNumId w:val="44"/>
   </w:num>
   <w:num w:numId="27" w16cid:durableId="115023097">
-    <w:abstractNumId w:val="53"/>
+    <w:abstractNumId w:val="52"/>
   </w:num>
   <w:num w:numId="28" w16cid:durableId="213129769">
-    <w:abstractNumId w:val="36"/>
+    <w:abstractNumId w:val="35"/>
   </w:num>
   <w:num w:numId="29" w16cid:durableId="1685134809">
-    <w:abstractNumId w:val="66"/>
+    <w:abstractNumId w:val="65"/>
   </w:num>
   <w:num w:numId="30" w16cid:durableId="334116450">
-    <w:abstractNumId w:val="47"/>
+    <w:abstractNumId w:val="46"/>
   </w:num>
   <w:num w:numId="31" w16cid:durableId="288753872">
     <w:abstractNumId w:val="17"/>
   </w:num>
   <w:num w:numId="32" w16cid:durableId="1609384970">
-    <w:abstractNumId w:val="43"/>
+    <w:abstractNumId w:val="42"/>
   </w:num>
   <w:num w:numId="33" w16cid:durableId="2103724144">
     <w:abstractNumId w:val="4"/>
   </w:num>
   <w:num w:numId="34" w16cid:durableId="1939363759">
-    <w:abstractNumId w:val="44"/>
+    <w:abstractNumId w:val="43"/>
   </w:num>
   <w:num w:numId="35" w16cid:durableId="299573115">
     <w:abstractNumId w:val="12"/>
   </w:num>
   <w:num w:numId="36" w16cid:durableId="2006589660">
-    <w:abstractNumId w:val="81"/>
+    <w:abstractNumId w:val="80"/>
   </w:num>
   <w:num w:numId="37" w16cid:durableId="1915819383">
-    <w:abstractNumId w:val="46"/>
+    <w:abstractNumId w:val="45"/>
   </w:num>
   <w:num w:numId="38" w16cid:durableId="1882941507">
     <w:abstractNumId w:val="19"/>
@@ -25921,37 +25514,37 @@
     <w:abstractNumId w:val="20"/>
   </w:num>
   <w:num w:numId="40" w16cid:durableId="1081373702">
-    <w:abstractNumId w:val="63"/>
+    <w:abstractNumId w:val="62"/>
   </w:num>
   <w:num w:numId="41" w16cid:durableId="1441879789">
-    <w:abstractNumId w:val="62"/>
+    <w:abstractNumId w:val="61"/>
   </w:num>
   <w:num w:numId="42" w16cid:durableId="1899394195">
     <w:abstractNumId w:val="13"/>
   </w:num>
   <w:num w:numId="43" w16cid:durableId="351673">
-    <w:abstractNumId w:val="80"/>
+    <w:abstractNumId w:val="79"/>
   </w:num>
   <w:num w:numId="44" w16cid:durableId="1119182622">
-    <w:abstractNumId w:val="68"/>
+    <w:abstractNumId w:val="67"/>
   </w:num>
   <w:num w:numId="45" w16cid:durableId="46951889">
-    <w:abstractNumId w:val="57"/>
+    <w:abstractNumId w:val="56"/>
   </w:num>
   <w:num w:numId="46" w16cid:durableId="802115814">
-    <w:abstractNumId w:val="39"/>
+    <w:abstractNumId w:val="38"/>
   </w:num>
   <w:num w:numId="47" w16cid:durableId="1060178466">
-    <w:abstractNumId w:val="42"/>
+    <w:abstractNumId w:val="41"/>
   </w:num>
   <w:num w:numId="48" w16cid:durableId="616332582">
-    <w:abstractNumId w:val="82"/>
+    <w:abstractNumId w:val="81"/>
   </w:num>
   <w:num w:numId="49" w16cid:durableId="90858907">
-    <w:abstractNumId w:val="71"/>
+    <w:abstractNumId w:val="70"/>
   </w:num>
   <w:num w:numId="50" w16cid:durableId="2083327266">
-    <w:abstractNumId w:val="38"/>
+    <w:abstractNumId w:val="37"/>
   </w:num>
   <w:num w:numId="51" w16cid:durableId="770781857">
     <w:abstractNumId w:val="10"/>
@@ -25960,52 +25553,52 @@
     <w:abstractNumId w:val="7"/>
   </w:num>
   <w:num w:numId="53" w16cid:durableId="2076513931">
-    <w:abstractNumId w:val="41"/>
+    <w:abstractNumId w:val="40"/>
   </w:num>
   <w:num w:numId="54" w16cid:durableId="1326783001">
     <w:abstractNumId w:val="3"/>
   </w:num>
   <w:num w:numId="55" w16cid:durableId="2087336444">
-    <w:abstractNumId w:val="74"/>
+    <w:abstractNumId w:val="73"/>
   </w:num>
   <w:num w:numId="56" w16cid:durableId="1418014675">
     <w:abstractNumId w:val="21"/>
   </w:num>
   <w:num w:numId="57" w16cid:durableId="1341348550">
-    <w:abstractNumId w:val="83"/>
+    <w:abstractNumId w:val="82"/>
   </w:num>
   <w:num w:numId="58" w16cid:durableId="2145267286">
-    <w:abstractNumId w:val="26"/>
+    <w:abstractNumId w:val="25"/>
   </w:num>
   <w:num w:numId="59" w16cid:durableId="474301162">
-    <w:abstractNumId w:val="52"/>
+    <w:abstractNumId w:val="51"/>
   </w:num>
   <w:num w:numId="60" w16cid:durableId="195388166">
-    <w:abstractNumId w:val="61"/>
+    <w:abstractNumId w:val="60"/>
   </w:num>
   <w:num w:numId="61" w16cid:durableId="1035232521">
-    <w:abstractNumId w:val="32"/>
+    <w:abstractNumId w:val="31"/>
   </w:num>
   <w:num w:numId="62" w16cid:durableId="734934737">
-    <w:abstractNumId w:val="51"/>
+    <w:abstractNumId w:val="50"/>
   </w:num>
   <w:num w:numId="63" w16cid:durableId="1241334619">
     <w:abstractNumId w:val="16"/>
   </w:num>
   <w:num w:numId="64" w16cid:durableId="2086947346">
-    <w:abstractNumId w:val="30"/>
+    <w:abstractNumId w:val="29"/>
   </w:num>
   <w:num w:numId="65" w16cid:durableId="573784628">
-    <w:abstractNumId w:val="72"/>
+    <w:abstractNumId w:val="71"/>
   </w:num>
   <w:num w:numId="66" w16cid:durableId="1766725045">
     <w:abstractNumId w:val="14"/>
   </w:num>
   <w:num w:numId="67" w16cid:durableId="798036123">
-    <w:abstractNumId w:val="75"/>
+    <w:abstractNumId w:val="74"/>
   </w:num>
   <w:num w:numId="68" w16cid:durableId="1927838187">
-    <w:abstractNumId w:val="33"/>
+    <w:abstractNumId w:val="32"/>
   </w:num>
   <w:num w:numId="69" w16cid:durableId="1011417702">
     <w:abstractNumId w:val="6"/>
@@ -26014,16 +25607,16 @@
     <w:abstractNumId w:val="24"/>
   </w:num>
   <w:num w:numId="71" w16cid:durableId="1785421892">
-    <w:abstractNumId w:val="84"/>
+    <w:abstractNumId w:val="83"/>
   </w:num>
   <w:num w:numId="72" w16cid:durableId="1579946811">
-    <w:abstractNumId w:val="60"/>
+    <w:abstractNumId w:val="59"/>
   </w:num>
   <w:num w:numId="73" w16cid:durableId="42104193">
-    <w:abstractNumId w:val="76"/>
+    <w:abstractNumId w:val="75"/>
   </w:num>
   <w:num w:numId="74" w16cid:durableId="1967655890">
-    <w:abstractNumId w:val="29"/>
+    <w:abstractNumId w:val="28"/>
   </w:num>
   <w:num w:numId="75" w16cid:durableId="499390431">
     <w:abstractNumId w:val="23"/>
@@ -26038,26 +25631,24 @@
     <w:abstractNumId w:val="22"/>
   </w:num>
   <w:num w:numId="79" w16cid:durableId="1426732330">
-    <w:abstractNumId w:val="54"/>
+    <w:abstractNumId w:val="53"/>
   </w:num>
   <w:num w:numId="80" w16cid:durableId="924649910">
-    <w:abstractNumId w:val="49"/>
+    <w:abstractNumId w:val="48"/>
   </w:num>
   <w:num w:numId="81" w16cid:durableId="1018310199">
-    <w:abstractNumId w:val="35"/>
+    <w:abstractNumId w:val="34"/>
   </w:num>
   <w:num w:numId="82" w16cid:durableId="1101880396">
-    <w:abstractNumId w:val="31"/>
+    <w:abstractNumId w:val="30"/>
   </w:num>
-  <w:num w:numId="83" w16cid:durableId="1236431580">
-    <w:abstractNumId w:val="25"/>
+  <w:num w:numId="83" w16cid:durableId="513110394">
+    <w:abstractNumId w:val="39"/>
   </w:num>
-  <w:num w:numId="84" w16cid:durableId="513110394">
-    <w:abstractNumId w:val="40"/>
-  </w:num>
-  <w:num w:numId="85" w16cid:durableId="1145901104">
+  <w:num w:numId="84" w16cid:durableId="1145901104">
     <w:abstractNumId w:val="11"/>
   </w:num>
+  <w:numIdMacAtCleanup w:val="84"/>
 </w:numbering>
 </file>
 
@@ -26662,6 +26253,7 @@
   <w:style w:type="character" w:default="1" w:styleId="Fontepargpadro">
     <w:name w:val="Default Paragraph Font"/>
     <w:uiPriority w:val="1"/>
+    <w:semiHidden/>
     <w:unhideWhenUsed/>
   </w:style>
   <w:style w:type="table" w:default="1" w:styleId="Tabelanormal">

</xml_diff>